<commit_message>
prog lab7 and db lab3
</commit_message>
<xml_diff>
--- a/DataBases/lab3/Лаб3.docx
+++ b/DataBases/lab3/Лаб3.docx
@@ -901,6 +901,11 @@
                 <w:rStyle w:val="Style13"/>
               </w:rPr>
               <w:t>Задание.</w:t>
+            </w:r>
+            <w:r>
+              <w:rPr>
+                <w:rStyle w:val="Style13"/>
+              </w:rPr>
               <w:tab/>
               <w:t>3</w:t>
             </w:r>
@@ -1863,7 +1868,9 @@
         </w:rPr>
       </w:pPr>
       <w:r>
-        <w:rPr/>
+        <w:rPr>
+          <w:lang w:val="en-US"/>
+        </w:rPr>
       </w:r>
     </w:p>
     <w:p>
@@ -2433,19 +2440,7 @@
         <w:rPr>
           <w:lang w:val="ru-RU"/>
         </w:rPr>
-        <w:t xml:space="preserve"> </w:t>
-      </w:r>
-      <w:r>
-        <w:rPr>
-          <w:lang w:val="ru-RU"/>
-        </w:rPr>
-        <w:t>потенциальным</w:t>
-      </w:r>
-      <w:r>
-        <w:rPr>
-          <w:lang w:val="ru-RU"/>
-        </w:rPr>
-        <w:t xml:space="preserve"> </w:t>
+        <w:t xml:space="preserve"> потенциальным </w:t>
       </w:r>
       <w:r>
         <w:rPr>
@@ -2605,57 +2600,25 @@
           <w:szCs w:val="24"/>
           <w:lang w:val="en-US"/>
         </w:rPr>
-        <w:t xml:space="preserve">CREATE OR REPLACE FUNCTION </w:t>
-      </w:r>
-      <w:r>
-        <w:rPr>
-          <w:sz w:val="24"/>
-          <w:szCs w:val="24"/>
-          <w:lang w:val="en-US"/>
-        </w:rPr>
-        <w:t>person_update</w:t>
-      </w:r>
-      <w:r>
-        <w:rPr>
-          <w:sz w:val="24"/>
-          <w:szCs w:val="24"/>
-          <w:lang w:val="en-US"/>
-        </w:rPr>
-        <w:t>_trigger()</w:t>
-      </w:r>
-    </w:p>
-    <w:p>
-      <w:pPr>
-        <w:pStyle w:val="BodyText"/>
-        <w:rPr>
-          <w:sz w:val="24"/>
-          <w:szCs w:val="24"/>
-          <w:lang w:val="en-US"/>
-        </w:rPr>
-      </w:pPr>
-      <w:r>
-        <w:rPr>
-          <w:sz w:val="24"/>
-          <w:szCs w:val="24"/>
-          <w:lang w:val="en-US"/>
-        </w:rPr>
-        <w:t>RETURNS TRIGGER AS $</w:t>
-      </w:r>
-      <w:r>
-        <w:rPr>
-          <w:sz w:val="24"/>
-          <w:szCs w:val="24"/>
-          <w:lang w:val="en-US"/>
-        </w:rPr>
-        <w:t>person_update</w:t>
-      </w:r>
-      <w:r>
-        <w:rPr>
-          <w:sz w:val="24"/>
-          <w:szCs w:val="24"/>
-          <w:lang w:val="en-US"/>
-        </w:rPr>
-        <w:t>_trigger$</w:t>
+        <w:t>CREATE OR REPLACE FUNCTION person_update_trigger()</w:t>
+      </w:r>
+    </w:p>
+    <w:p>
+      <w:pPr>
+        <w:pStyle w:val="BodyText"/>
+        <w:rPr>
+          <w:sz w:val="24"/>
+          <w:szCs w:val="24"/>
+          <w:lang w:val="en-US"/>
+        </w:rPr>
+      </w:pPr>
+      <w:r>
+        <w:rPr>
+          <w:sz w:val="24"/>
+          <w:szCs w:val="24"/>
+          <w:lang w:val="en-US"/>
+        </w:rPr>
+        <w:t>RETURNS TRIGGER AS $person_update_trigger$</w:t>
       </w:r>
     </w:p>
     <w:p>
@@ -2692,13 +2655,6 @@
           <w:lang w:val="en-US"/>
         </w:rPr>
         <w:tab/>
-      </w:r>
-      <w:r>
-        <w:rPr>
-          <w:sz w:val="24"/>
-          <w:szCs w:val="24"/>
-          <w:lang w:val="en-US"/>
-        </w:rPr>
         <w:t>INSERT INTO person_updates (update_date, updated_by)</w:t>
       </w:r>
     </w:p>
@@ -2773,141 +2729,61 @@
           <w:szCs w:val="24"/>
           <w:lang w:val="en-US"/>
         </w:rPr>
-        <w:t>$</w:t>
-      </w:r>
-      <w:r>
-        <w:rPr>
-          <w:sz w:val="24"/>
-          <w:szCs w:val="24"/>
-          <w:lang w:val="en-US"/>
-        </w:rPr>
-        <w:t>person_update</w:t>
-      </w:r>
-      <w:r>
-        <w:rPr>
-          <w:sz w:val="24"/>
-          <w:szCs w:val="24"/>
-          <w:lang w:val="en-US"/>
-        </w:rPr>
-        <w:t>_trigger$ LANGUAGE plpgsql;</w:t>
-      </w:r>
-    </w:p>
-    <w:p>
-      <w:pPr>
-        <w:pStyle w:val="BodyText"/>
-        <w:rPr>
-          <w:sz w:val="24"/>
-          <w:szCs w:val="24"/>
-          <w:lang w:val="en-US"/>
-        </w:rPr>
-      </w:pPr>
-      <w:r>
-        <w:rPr>
-          <w:sz w:val="24"/>
-          <w:szCs w:val="24"/>
-          <w:lang w:val="en-US"/>
-        </w:rPr>
-        <w:t xml:space="preserve">CREATE OR REPLACE TRIGGER </w:t>
-      </w:r>
-      <w:r>
-        <w:rPr>
-          <w:sz w:val="24"/>
-          <w:szCs w:val="24"/>
-          <w:lang w:val="en-US"/>
-        </w:rPr>
-        <w:t>Person_update</w:t>
-      </w:r>
-      <w:r>
-        <w:rPr>
-          <w:sz w:val="24"/>
-          <w:szCs w:val="24"/>
-          <w:lang w:val="en-US"/>
-        </w:rPr>
-        <w:t>_trigger</w:t>
-      </w:r>
-    </w:p>
-    <w:p>
-      <w:pPr>
-        <w:pStyle w:val="BodyText"/>
-        <w:rPr>
-          <w:sz w:val="24"/>
-          <w:szCs w:val="24"/>
-          <w:lang w:val="en-US"/>
-        </w:rPr>
-      </w:pPr>
-      <w:r>
-        <w:rPr>
-          <w:sz w:val="24"/>
-          <w:szCs w:val="24"/>
-          <w:lang w:val="en-US"/>
-        </w:rPr>
-        <w:t>AFTER</w:t>
-      </w:r>
-      <w:r>
-        <w:rPr>
-          <w:sz w:val="24"/>
-          <w:szCs w:val="24"/>
-          <w:lang w:val="en-US"/>
-        </w:rPr>
-        <w:t xml:space="preserve"> UPDATE </w:t>
-      </w:r>
-      <w:r>
-        <w:rPr>
-          <w:sz w:val="24"/>
-          <w:szCs w:val="24"/>
-          <w:lang w:val="en-US"/>
-        </w:rPr>
-        <w:t xml:space="preserve">OR INSERT </w:t>
-      </w:r>
-      <w:r>
-        <w:rPr>
-          <w:sz w:val="24"/>
-          <w:szCs w:val="24"/>
-          <w:lang w:val="en-US"/>
-        </w:rPr>
-        <w:t xml:space="preserve">ON </w:t>
-      </w:r>
-      <w:r>
-        <w:rPr>
-          <w:sz w:val="24"/>
-          <w:szCs w:val="24"/>
-          <w:lang w:val="en-US"/>
-        </w:rPr>
-        <w:t>person</w:t>
-      </w:r>
-    </w:p>
-    <w:p>
-      <w:pPr>
-        <w:pStyle w:val="BodyText"/>
-        <w:rPr>
-          <w:sz w:val="24"/>
-          <w:szCs w:val="24"/>
-          <w:lang w:val="en-US"/>
-        </w:rPr>
-      </w:pPr>
-      <w:r>
-        <w:rPr>
-          <w:sz w:val="24"/>
-          <w:szCs w:val="24"/>
-          <w:lang w:val="en-US"/>
-        </w:rPr>
-        <w:t xml:space="preserve">FOR EACH ROW EXECUTE FUNCTION </w:t>
-      </w:r>
-      <w:r>
-        <w:rPr>
-          <w:sz w:val="24"/>
-          <w:szCs w:val="24"/>
-          <w:lang w:val="en-US"/>
-        </w:rPr>
-        <w:t>person_update</w:t>
-      </w:r>
-      <w:r>
-        <w:rPr>
-          <w:sz w:val="24"/>
-          <w:szCs w:val="24"/>
-          <w:lang w:val="en-US"/>
-        </w:rPr>
-        <w:t xml:space="preserve">_trigger(); </w:t>
+        <w:t>$person_update_trigger$ LANGUAGE plpgsql;</w:t>
+      </w:r>
+    </w:p>
+    <w:p>
+      <w:pPr>
+        <w:pStyle w:val="BodyText"/>
+        <w:rPr>
+          <w:sz w:val="24"/>
+          <w:szCs w:val="24"/>
+          <w:lang w:val="en-US"/>
+        </w:rPr>
+      </w:pPr>
+      <w:r>
+        <w:rPr>
+          <w:sz w:val="24"/>
+          <w:szCs w:val="24"/>
+          <w:lang w:val="en-US"/>
+        </w:rPr>
+        <w:t>CREATE OR REPLACE TRIGGER Person_update_trigger</w:t>
+      </w:r>
+    </w:p>
+    <w:p>
+      <w:pPr>
+        <w:pStyle w:val="BodyText"/>
+        <w:rPr>
+          <w:sz w:val="24"/>
+          <w:szCs w:val="24"/>
+          <w:lang w:val="en-US"/>
+        </w:rPr>
+      </w:pPr>
+      <w:r>
+        <w:rPr>
+          <w:sz w:val="24"/>
+          <w:szCs w:val="24"/>
+          <w:lang w:val="en-US"/>
+        </w:rPr>
+        <w:t>AFTER UPDATE OR INSERT ON person</w:t>
+      </w:r>
+    </w:p>
+    <w:p>
+      <w:pPr>
+        <w:pStyle w:val="BodyText"/>
+        <w:rPr>
+          <w:sz w:val="24"/>
+          <w:szCs w:val="24"/>
+          <w:lang w:val="en-US"/>
+        </w:rPr>
+      </w:pPr>
+      <w:r>
+        <w:rPr>
+          <w:sz w:val="24"/>
+          <w:szCs w:val="24"/>
+          <w:lang w:val="en-US"/>
+        </w:rPr>
+        <w:t xml:space="preserve">FOR EACH ROW EXECUTE FUNCTION person_update_trigger(); </w:t>
       </w:r>
     </w:p>
     <w:p>
@@ -2959,6 +2835,22 @@
           <w:lang w:val="en-US"/>
         </w:rPr>
         <w:t>PL/pgSQL.</w:t>
+      </w:r>
+    </w:p>
+    <w:p>
+      <w:pPr>
+        <w:pStyle w:val="BodyText"/>
+        <w:bidi w:val="0"/>
+        <w:spacing w:before="0" w:after="140"/>
+        <w:jc w:val="left"/>
+        <w:rPr>
+          <w:lang w:val="ru-RU"/>
+        </w:rPr>
+      </w:pPr>
+      <w:r>
+        <w:rPr>
+          <w:lang w:val="ru-RU"/>
+        </w:rPr>
       </w:r>
     </w:p>
     <w:sectPr>
@@ -3397,7 +3289,7 @@
     <w:pPr>
       <w:widowControl/>
       <w:suppressAutoHyphens w:val="true"/>
-      <w:overflowPunct w:val="false"/>
+      <w:overflowPunct w:val="true"/>
       <w:bidi w:val="0"/>
       <w:spacing w:before="0" w:after="0"/>
       <w:jc w:val="left"/>

</xml_diff>